<commit_message>
Create an endpoin that downloads all files from admin dashboard
</commit_message>
<xml_diff>
--- a/Methodology.docx
+++ b/Methodology.docx
@@ -1,6 +1,6 @@
 
 <file path=word/document.xml><?xml version="1.0" encoding="utf-8"?>
-<w:document xmlns:wpc="http://schemas.microsoft.com/office/word/2010/wordprocessingCanvas" xmlns:cx="http://schemas.microsoft.com/office/drawing/2014/chartex" xmlns:cx1="http://schemas.microsoft.com/office/drawing/2015/9/8/chartex" xmlns:cx2="http://schemas.microsoft.com/office/drawing/2015/10/21/chartex" xmlns:cx3="http://schemas.microsoft.com/office/drawing/2016/5/9/chartex" xmlns:cx4="http://schemas.microsoft.com/office/drawing/2016/5/10/chartex" xmlns:cx5="http://schemas.microsoft.com/office/drawing/2016/5/11/chartex" xmlns:cx6="http://schemas.microsoft.com/office/drawing/2016/5/12/chartex" xmlns:cx7="http://schemas.microsoft.com/office/drawing/2016/5/13/chartex" xmlns:cx8="http://schemas.microsoft.com/office/drawing/2016/5/14/chartex" xmlns:mc="http://schemas.openxmlformats.org/markup-compatibility/2006" xmlns:aink="http://schemas.microsoft.com/office/drawing/2016/ink" xmlns:am3d="http://schemas.microsoft.com/office/drawing/2017/model3d" xmlns:o="urn:schemas-microsoft-com:office:office" xmlns:oel="http://schemas.microsoft.com/office/2019/extlst" xmlns:r="http://schemas.openxmlformats.org/officeDocument/2006/relationships" xmlns:m="http://schemas.openxmlformats.org/officeDocument/2006/math" xmlns:v="urn:schemas-microsoft-com:vml" xmlns:wp14="http://schemas.microsoft.com/office/word/2010/wordprocessingDrawing" xmlns:wp="http://schemas.openxmlformats.org/drawingml/2006/wordprocessingDrawing" xmlns:w10="urn:schemas-microsoft-com:office:word" xmlns:w="http://schemas.openxmlformats.org/wordprocessingml/2006/main" xmlns:w14="http://schemas.microsoft.com/office/word/2010/wordml" xmlns:w15="http://schemas.microsoft.com/office/word/2012/wordml" xmlns:w16cex="http://schemas.microsoft.com/office/word/2018/wordml/cex" xmlns:w16cid="http://schemas.microsoft.com/office/word/2016/wordml/cid" xmlns:w16="http://schemas.microsoft.com/office/word/2018/wordml" xmlns:w16du="http://schemas.microsoft.com/office/word/2023/wordml/word16du" xmlns:w16sdtdh="http://schemas.microsoft.com/office/word/2020/wordml/sdtdatahash" xmlns:w16sdtfl="http://schemas.microsoft.com/office/word/2024/wordml/sdtformatlock" xmlns:w16se="http://schemas.microsoft.com/office/word/2015/wordml/symex" xmlns:wpg="http://schemas.microsoft.com/office/word/2010/wordprocessingGroup" xmlns:wpi="http://schemas.microsoft.com/office/word/2010/wordprocessingInk" xmlns:wne="http://schemas.microsoft.com/office/word/2006/wordml" xmlns:wps="http://schemas.microsoft.com/office/word/2010/wordprocessingShape" mc:Ignorable="w14 w15 w16se w16cid w16 w16cex w16sdtdh w16sdtfl w16du wp14">
+<w:document xmlns:wpc="http://schemas.microsoft.com/office/word/2010/wordprocessingCanvas" xmlns:cx="http://schemas.microsoft.com/office/drawing/2014/chartex" xmlns:cx1="http://schemas.microsoft.com/office/drawing/2015/9/8/chartex" xmlns:cx2="http://schemas.microsoft.com/office/drawing/2015/10/21/chartex" xmlns:cx3="http://schemas.microsoft.com/office/drawing/2016/5/9/chartex" xmlns:cx4="http://schemas.microsoft.com/office/drawing/2016/5/10/chartex" xmlns:cx5="http://schemas.microsoft.com/office/drawing/2016/5/11/chartex" xmlns:cx6="http://schemas.microsoft.com/office/drawing/2016/5/12/chartex" xmlns:cx7="http://schemas.microsoft.com/office/drawing/2016/5/13/chartex" xmlns:cx8="http://schemas.microsoft.com/office/drawing/2016/5/14/chartex" xmlns:mc="http://schemas.openxmlformats.org/markup-compatibility/2006" xmlns:aink="http://schemas.microsoft.com/office/drawing/2016/ink" xmlns:am3d="http://schemas.microsoft.com/office/drawing/2017/model3d" xmlns:o="urn:schemas-microsoft-com:office:office" xmlns:oel="http://schemas.microsoft.com/office/2019/extlst" xmlns:r="http://schemas.openxmlformats.org/officeDocument/2006/relationships" xmlns:m="http://schemas.openxmlformats.org/officeDocument/2006/math" xmlns:v="urn:schemas-microsoft-com:vml" xmlns:wp14="http://schemas.microsoft.com/office/word/2010/wordprocessingDrawing" xmlns:wp="http://schemas.openxmlformats.org/drawingml/2006/wordprocessingDrawing" xmlns:w10="urn:schemas-microsoft-com:office:word" xmlns:w="http://schemas.openxmlformats.org/wordprocessingml/2006/main" xmlns:w14="http://schemas.microsoft.com/office/word/2010/wordml" xmlns:w15="http://schemas.microsoft.com/office/word/2012/wordml" xmlns:w16cex="http://schemas.microsoft.com/office/word/2018/wordml/cex" xmlns:w16cid="http://schemas.microsoft.com/office/word/2016/wordml/cid" xmlns:w16="http://schemas.microsoft.com/office/word/2018/wordml" xmlns:w16du="http://schemas.microsoft.com/office/word/2023/wordml/word16du" xmlns:w16sdtdh="http://schemas.microsoft.com/office/word/2020/wordml/sdtdatahash" xmlns:w16se="http://schemas.microsoft.com/office/word/2015/wordml/symex" xmlns:wpg="http://schemas.microsoft.com/office/word/2010/wordprocessingGroup" xmlns:wpi="http://schemas.microsoft.com/office/word/2010/wordprocessingInk" xmlns:wne="http://schemas.microsoft.com/office/word/2006/wordml" xmlns:wps="http://schemas.microsoft.com/office/word/2010/wordprocessingShape" mc:Ignorable="w14 w15 w16se w16cid w16 w16cex w16sdtdh w16du wp14">
   <w:body>
     <w:p>
       <w:pPr>
@@ -115,7 +115,7 @@
       <w:pPr>
         <w:spacing w:after="240"/>
         <w:rPr>
-          <w:rFonts w:ascii="Times New Roman" w:hAnsi="Times New Roman" w:cs="Times New Roman" w:hint="eastAsia"/>
+          <w:rFonts w:ascii="Times New Roman" w:hAnsi="Times New Roman" w:cs="Times New Roman"/>
           <w:sz w:val="24"/>
         </w:rPr>
       </w:pPr>
@@ -311,7 +311,7 @@
       <w:pPr>
         <w:spacing w:before="0" w:after="240"/>
         <w:rPr>
-          <w:rFonts w:ascii="Times New Roman" w:hAnsi="Times New Roman" w:cs="Times New Roman" w:hint="eastAsia"/>
+          <w:rFonts w:ascii="Times New Roman" w:hAnsi="Times New Roman" w:cs="Times New Roman"/>
           <w:sz w:val="24"/>
         </w:rPr>
       </w:pPr>
@@ -345,24 +345,49 @@
         <w:tblLook w:val="04A0" w:firstRow="1" w:lastRow="0" w:firstColumn="1" w:lastColumn="0" w:noHBand="0" w:noVBand="1"/>
       </w:tblPr>
       <w:tblGrid>
-        <w:gridCol w:w="3687"/>
-        <w:gridCol w:w="2754"/>
+        <w:gridCol w:w="3486"/>
+        <w:gridCol w:w="2955"/>
         <w:gridCol w:w="3624"/>
       </w:tblGrid>
       <w:tr>
         <w:tc>
           <w:tcPr>
-            <w:tcW w:w="3687" w:type="dxa"/>
+            <w:tcW w:w="3486" w:type="dxa"/>
           </w:tcPr>
           <w:p>
             <w:pPr>
               <w:jc w:val="center"/>
+              <w:rPr>
+                <w:rFonts w:ascii="Times New Roman" w:hAnsi="Times New Roman" w:cs="Times New Roman"/>
+                <w:b/>
+                <w:bCs/>
+                <w:sz w:val="24"/>
+              </w:rPr>
+            </w:pPr>
+            <w:r>
               <w:rPr>
                 <w:rFonts w:ascii="Times New Roman" w:hAnsi="Times New Roman" w:cs="Times New Roman" w:hint="eastAsia"/>
                 <w:b/>
                 <w:bCs/>
                 <w:sz w:val="24"/>
               </w:rPr>
+              <w:t>Sample Category</w:t>
+            </w:r>
+          </w:p>
+        </w:tc>
+        <w:tc>
+          <w:tcPr>
+            <w:tcW w:w="2955" w:type="dxa"/>
+          </w:tcPr>
+          <w:p>
+            <w:pPr>
+              <w:jc w:val="center"/>
+              <w:rPr>
+                <w:rFonts w:ascii="Times New Roman" w:hAnsi="Times New Roman" w:cs="Times New Roman"/>
+                <w:b/>
+                <w:bCs/>
+                <w:sz w:val="24"/>
+              </w:rPr>
             </w:pPr>
             <w:r>
               <w:rPr>
@@ -371,56 +396,31 @@
                 <w:bCs/>
                 <w:sz w:val="24"/>
               </w:rPr>
-              <w:t>Sample Category</w:t>
-            </w:r>
-          </w:p>
-        </w:tc>
-        <w:tc>
-          <w:tcPr>
-            <w:tcW w:w="2754" w:type="dxa"/>
+              <w:t>Subcategory</w:t>
+            </w:r>
+          </w:p>
+        </w:tc>
+        <w:tc>
+          <w:tcPr>
+            <w:tcW w:w="3624" w:type="dxa"/>
           </w:tcPr>
           <w:p>
             <w:pPr>
               <w:jc w:val="center"/>
+              <w:rPr>
+                <w:rFonts w:ascii="Times New Roman" w:hAnsi="Times New Roman" w:cs="Times New Roman"/>
+                <w:b/>
+                <w:bCs/>
+                <w:sz w:val="24"/>
+              </w:rPr>
+            </w:pPr>
+            <w:r>
               <w:rPr>
                 <w:rFonts w:ascii="Times New Roman" w:hAnsi="Times New Roman" w:cs="Times New Roman" w:hint="eastAsia"/>
                 <w:b/>
                 <w:bCs/>
                 <w:sz w:val="24"/>
               </w:rPr>
-            </w:pPr>
-            <w:r>
-              <w:rPr>
-                <w:rFonts w:ascii="Times New Roman" w:hAnsi="Times New Roman" w:cs="Times New Roman" w:hint="eastAsia"/>
-                <w:b/>
-                <w:bCs/>
-                <w:sz w:val="24"/>
-              </w:rPr>
-              <w:t>Subcategory</w:t>
-            </w:r>
-          </w:p>
-        </w:tc>
-        <w:tc>
-          <w:tcPr>
-            <w:tcW w:w="3624" w:type="dxa"/>
-          </w:tcPr>
-          <w:p>
-            <w:pPr>
-              <w:jc w:val="center"/>
-              <w:rPr>
-                <w:rFonts w:ascii="Times New Roman" w:hAnsi="Times New Roman" w:cs="Times New Roman" w:hint="eastAsia"/>
-                <w:b/>
-                <w:bCs/>
-                <w:sz w:val="24"/>
-              </w:rPr>
-            </w:pPr>
-            <w:r>
-              <w:rPr>
-                <w:rFonts w:ascii="Times New Roman" w:hAnsi="Times New Roman" w:cs="Times New Roman" w:hint="eastAsia"/>
-                <w:b/>
-                <w:bCs/>
-                <w:sz w:val="24"/>
-              </w:rPr>
               <w:t>Description</w:t>
             </w:r>
           </w:p>
@@ -429,7 +429,7 @@
       <w:tr>
         <w:tc>
           <w:tcPr>
-            <w:tcW w:w="3687" w:type="dxa"/>
+            <w:tcW w:w="3486" w:type="dxa"/>
           </w:tcPr>
           <w:p>
             <w:pPr>
@@ -454,20 +454,20 @@
         </w:tc>
         <w:tc>
           <w:tcPr>
-            <w:tcW w:w="2754" w:type="dxa"/>
-          </w:tcPr>
-          <w:p>
-            <w:pPr>
+            <w:tcW w:w="2955" w:type="dxa"/>
+          </w:tcPr>
+          <w:p>
+            <w:pPr>
+              <w:rPr>
+                <w:rFonts w:ascii="Times New Roman" w:hAnsi="Times New Roman" w:cs="Times New Roman"/>
+                <w:sz w:val="24"/>
+              </w:rPr>
+            </w:pPr>
+            <w:r>
               <w:rPr>
                 <w:rFonts w:ascii="Times New Roman" w:hAnsi="Times New Roman" w:cs="Times New Roman" w:hint="eastAsia"/>
                 <w:sz w:val="24"/>
               </w:rPr>
-            </w:pPr>
-            <w:r>
-              <w:rPr>
-                <w:rFonts w:ascii="Times New Roman" w:hAnsi="Times New Roman" w:cs="Times New Roman" w:hint="eastAsia"/>
-                <w:sz w:val="24"/>
-              </w:rPr>
               <w:t>NA</w:t>
             </w:r>
           </w:p>
@@ -480,7 +480,7 @@
             <w:pPr>
               <w:jc w:val="left"/>
               <w:rPr>
-                <w:rFonts w:ascii="Times New Roman" w:hAnsi="Times New Roman" w:cs="Times New Roman" w:hint="eastAsia"/>
+                <w:rFonts w:ascii="Times New Roman" w:hAnsi="Times New Roman" w:cs="Times New Roman"/>
                 <w:sz w:val="24"/>
               </w:rPr>
             </w:pPr>
@@ -497,7 +497,7 @@
       <w:tr>
         <w:tc>
           <w:tcPr>
-            <w:tcW w:w="3687" w:type="dxa"/>
+            <w:tcW w:w="3486" w:type="dxa"/>
             <w:vMerge w:val="restart"/>
           </w:tcPr>
           <w:p>
@@ -508,35 +508,35 @@
                 <w:numId w:val="7"/>
               </w:numPr>
               <w:rPr>
+                <w:rFonts w:ascii="Times New Roman" w:hAnsi="Times New Roman" w:cs="Times New Roman"/>
+                <w:sz w:val="24"/>
+              </w:rPr>
+            </w:pPr>
+            <w:r>
+              <w:rPr>
                 <w:rFonts w:ascii="Times New Roman" w:hAnsi="Times New Roman" w:cs="Times New Roman" w:hint="eastAsia"/>
                 <w:sz w:val="24"/>
               </w:rPr>
+              <w:t>Profiles with intentional errors</w:t>
+            </w:r>
+          </w:p>
+        </w:tc>
+        <w:tc>
+          <w:tcPr>
+            <w:tcW w:w="2955" w:type="dxa"/>
+          </w:tcPr>
+          <w:p>
+            <w:pPr>
+              <w:rPr>
+                <w:rFonts w:ascii="Times New Roman" w:hAnsi="Times New Roman" w:cs="Times New Roman"/>
+                <w:sz w:val="24"/>
+              </w:rPr>
             </w:pPr>
             <w:r>
               <w:rPr>
                 <w:rFonts w:ascii="Times New Roman" w:hAnsi="Times New Roman" w:cs="Times New Roman" w:hint="eastAsia"/>
                 <w:sz w:val="24"/>
               </w:rPr>
-              <w:t>Profiles with intentional errors</w:t>
-            </w:r>
-          </w:p>
-        </w:tc>
-        <w:tc>
-          <w:tcPr>
-            <w:tcW w:w="2754" w:type="dxa"/>
-          </w:tcPr>
-          <w:p>
-            <w:pPr>
-              <w:rPr>
-                <w:rFonts w:ascii="Times New Roman" w:hAnsi="Times New Roman" w:cs="Times New Roman" w:hint="eastAsia"/>
-                <w:sz w:val="24"/>
-              </w:rPr>
-            </w:pPr>
-            <w:r>
-              <w:rPr>
-                <w:rFonts w:ascii="Times New Roman" w:hAnsi="Times New Roman" w:cs="Times New Roman" w:hint="eastAsia"/>
-                <w:sz w:val="24"/>
-              </w:rPr>
               <w:t>2a</w:t>
             </w:r>
           </w:p>
@@ -548,16 +548,16 @@
           <w:p>
             <w:pPr>
               <w:rPr>
-                <w:rFonts w:ascii="Times New Roman" w:hAnsi="Times New Roman" w:cs="Times New Roman" w:hint="eastAsia"/>
-                <w:sz w:val="24"/>
-              </w:rPr>
-            </w:pPr>
-            <w:r>
-              <w:rPr>
-                <w:rFonts w:ascii="Times New Roman" w:hAnsi="Times New Roman" w:cs="Times New Roman" w:hint="eastAsia"/>
-                <w:sz w:val="24"/>
-              </w:rPr>
-              <w:t>Invalid ICD codes</w:t>
+                <w:rFonts w:ascii="Times New Roman" w:hAnsi="Times New Roman" w:cs="Times New Roman"/>
+                <w:sz w:val="24"/>
+              </w:rPr>
+            </w:pPr>
+            <w:r>
+              <w:rPr>
+                <w:rFonts w:ascii="Times New Roman" w:hAnsi="Times New Roman" w:cs="Times New Roman"/>
+                <w:sz w:val="24"/>
+              </w:rPr>
+              <w:t>Date of birth error</w:t>
             </w:r>
           </w:p>
         </w:tc>
@@ -565,34 +565,34 @@
       <w:tr>
         <w:tc>
           <w:tcPr>
-            <w:tcW w:w="3687" w:type="dxa"/>
+            <w:tcW w:w="3486" w:type="dxa"/>
             <w:vMerge/>
           </w:tcPr>
           <w:p>
             <w:pPr>
               <w:rPr>
+                <w:rFonts w:ascii="Times New Roman" w:hAnsi="Times New Roman" w:cs="Times New Roman"/>
+                <w:sz w:val="24"/>
+              </w:rPr>
+            </w:pPr>
+          </w:p>
+        </w:tc>
+        <w:tc>
+          <w:tcPr>
+            <w:tcW w:w="2955" w:type="dxa"/>
+          </w:tcPr>
+          <w:p>
+            <w:pPr>
+              <w:rPr>
+                <w:rFonts w:ascii="Times New Roman" w:hAnsi="Times New Roman" w:cs="Times New Roman"/>
+                <w:sz w:val="24"/>
+              </w:rPr>
+            </w:pPr>
+            <w:r>
+              <w:rPr>
                 <w:rFonts w:ascii="Times New Roman" w:hAnsi="Times New Roman" w:cs="Times New Roman" w:hint="eastAsia"/>
                 <w:sz w:val="24"/>
               </w:rPr>
-            </w:pPr>
-          </w:p>
-        </w:tc>
-        <w:tc>
-          <w:tcPr>
-            <w:tcW w:w="2754" w:type="dxa"/>
-          </w:tcPr>
-          <w:p>
-            <w:pPr>
-              <w:rPr>
-                <w:rFonts w:ascii="Times New Roman" w:hAnsi="Times New Roman" w:cs="Times New Roman" w:hint="eastAsia"/>
-                <w:sz w:val="24"/>
-              </w:rPr>
-            </w:pPr>
-            <w:r>
-              <w:rPr>
-                <w:rFonts w:ascii="Times New Roman" w:hAnsi="Times New Roman" w:cs="Times New Roman" w:hint="eastAsia"/>
-                <w:sz w:val="24"/>
-              </w:rPr>
               <w:t>2b</w:t>
             </w:r>
           </w:p>
@@ -604,16 +604,16 @@
           <w:p>
             <w:pPr>
               <w:rPr>
-                <w:rFonts w:ascii="Times New Roman" w:hAnsi="Times New Roman" w:cs="Times New Roman" w:hint="eastAsia"/>
-                <w:sz w:val="24"/>
-              </w:rPr>
-            </w:pPr>
-            <w:r>
-              <w:rPr>
-                <w:rFonts w:ascii="Times New Roman" w:hAnsi="Times New Roman" w:cs="Times New Roman" w:hint="eastAsia"/>
-                <w:sz w:val="24"/>
-              </w:rPr>
-              <w:t>Wrong CPT codes</w:t>
+                <w:rFonts w:ascii="Times New Roman" w:hAnsi="Times New Roman" w:cs="Times New Roman"/>
+                <w:sz w:val="24"/>
+              </w:rPr>
+            </w:pPr>
+            <w:r>
+              <w:rPr>
+                <w:rFonts w:ascii="Times New Roman" w:hAnsi="Times New Roman" w:cs="Times New Roman"/>
+                <w:sz w:val="24"/>
+              </w:rPr>
+              <w:t>Chronological errors</w:t>
             </w:r>
           </w:p>
         </w:tc>
@@ -621,7 +621,7 @@
       <w:tr>
         <w:tc>
           <w:tcPr>
-            <w:tcW w:w="3687" w:type="dxa"/>
+            <w:tcW w:w="3486" w:type="dxa"/>
             <w:vMerge/>
           </w:tcPr>
           <w:p>
@@ -635,20 +635,20 @@
         </w:tc>
         <w:tc>
           <w:tcPr>
-            <w:tcW w:w="2754" w:type="dxa"/>
-          </w:tcPr>
-          <w:p>
-            <w:pPr>
+            <w:tcW w:w="2955" w:type="dxa"/>
+          </w:tcPr>
+          <w:p>
+            <w:pPr>
+              <w:rPr>
+                <w:rFonts w:ascii="Times New Roman" w:hAnsi="Times New Roman" w:cs="Times New Roman"/>
+                <w:sz w:val="24"/>
+              </w:rPr>
+            </w:pPr>
+            <w:r>
               <w:rPr>
                 <w:rFonts w:ascii="Times New Roman" w:hAnsi="Times New Roman" w:cs="Times New Roman" w:hint="eastAsia"/>
                 <w:sz w:val="24"/>
               </w:rPr>
-            </w:pPr>
-            <w:r>
-              <w:rPr>
-                <w:rFonts w:ascii="Times New Roman" w:hAnsi="Times New Roman" w:cs="Times New Roman" w:hint="eastAsia"/>
-                <w:sz w:val="24"/>
-              </w:rPr>
               <w:t>2c</w:t>
             </w:r>
           </w:p>
@@ -660,16 +660,16 @@
           <w:p>
             <w:pPr>
               <w:rPr>
-                <w:rFonts w:ascii="Times New Roman" w:hAnsi="Times New Roman" w:cs="Times New Roman" w:hint="eastAsia"/>
-                <w:sz w:val="24"/>
-              </w:rPr>
-            </w:pPr>
-            <w:r>
-              <w:rPr>
-                <w:rFonts w:ascii="Times New Roman" w:hAnsi="Times New Roman" w:cs="Times New Roman" w:hint="eastAsia"/>
-                <w:sz w:val="24"/>
-              </w:rPr>
-              <w:t>Invalid CPT codes</w:t>
+                <w:rFonts w:ascii="Times New Roman" w:hAnsi="Times New Roman" w:cs="Times New Roman"/>
+                <w:sz w:val="24"/>
+              </w:rPr>
+            </w:pPr>
+            <w:r>
+              <w:rPr>
+                <w:rFonts w:ascii="Times New Roman" w:hAnsi="Times New Roman" w:cs="Times New Roman"/>
+                <w:sz w:val="24"/>
+              </w:rPr>
+              <w:t>Missing required dates</w:t>
             </w:r>
           </w:p>
         </w:tc>
@@ -677,119 +677,7 @@
       <w:tr>
         <w:tc>
           <w:tcPr>
-            <w:tcW w:w="3687" w:type="dxa"/>
-            <w:vMerge/>
-          </w:tcPr>
-          <w:p>
-            <w:pPr>
-              <w:rPr>
-                <w:rFonts w:ascii="Times New Roman" w:hAnsi="Times New Roman" w:cs="Times New Roman"/>
-                <w:sz w:val="24"/>
-              </w:rPr>
-            </w:pPr>
-          </w:p>
-        </w:tc>
-        <w:tc>
-          <w:tcPr>
-            <w:tcW w:w="2754" w:type="dxa"/>
-          </w:tcPr>
-          <w:p>
-            <w:pPr>
-              <w:rPr>
-                <w:rFonts w:ascii="Times New Roman" w:hAnsi="Times New Roman" w:cs="Times New Roman" w:hint="eastAsia"/>
-                <w:sz w:val="24"/>
-              </w:rPr>
-            </w:pPr>
-            <w:r>
-              <w:rPr>
-                <w:rFonts w:ascii="Times New Roman" w:hAnsi="Times New Roman" w:cs="Times New Roman" w:hint="eastAsia"/>
-                <w:sz w:val="24"/>
-              </w:rPr>
-              <w:t>2d</w:t>
-            </w:r>
-          </w:p>
-        </w:tc>
-        <w:tc>
-          <w:tcPr>
-            <w:tcW w:w="3624" w:type="dxa"/>
-          </w:tcPr>
-          <w:p>
-            <w:pPr>
-              <w:rPr>
-                <w:rFonts w:ascii="Times New Roman" w:hAnsi="Times New Roman" w:cs="Times New Roman" w:hint="eastAsia"/>
-                <w:sz w:val="24"/>
-              </w:rPr>
-            </w:pPr>
-            <w:r>
-              <w:rPr>
-                <w:rFonts w:ascii="Times New Roman" w:hAnsi="Times New Roman" w:cs="Times New Roman" w:hint="eastAsia"/>
-                <w:sz w:val="24"/>
-              </w:rPr>
-              <w:t>Date logic error: sample collection date is earlier than prior test date</w:t>
-            </w:r>
-          </w:p>
-        </w:tc>
-      </w:tr>
-      <w:tr>
-        <w:tc>
-          <w:tcPr>
-            <w:tcW w:w="3687" w:type="dxa"/>
-            <w:vMerge/>
-          </w:tcPr>
-          <w:p>
-            <w:pPr>
-              <w:rPr>
-                <w:rFonts w:ascii="Times New Roman" w:hAnsi="Times New Roman" w:cs="Times New Roman"/>
-                <w:sz w:val="24"/>
-              </w:rPr>
-            </w:pPr>
-          </w:p>
-        </w:tc>
-        <w:tc>
-          <w:tcPr>
-            <w:tcW w:w="2754" w:type="dxa"/>
-          </w:tcPr>
-          <w:p>
-            <w:pPr>
-              <w:rPr>
-                <w:rFonts w:ascii="Times New Roman" w:hAnsi="Times New Roman" w:cs="Times New Roman" w:hint="eastAsia"/>
-                <w:sz w:val="24"/>
-              </w:rPr>
-            </w:pPr>
-            <w:r>
-              <w:rPr>
-                <w:rFonts w:ascii="Times New Roman" w:hAnsi="Times New Roman" w:cs="Times New Roman" w:hint="eastAsia"/>
-                <w:sz w:val="24"/>
-              </w:rPr>
-              <w:t>2e</w:t>
-            </w:r>
-          </w:p>
-        </w:tc>
-        <w:tc>
-          <w:tcPr>
-            <w:tcW w:w="3624" w:type="dxa"/>
-          </w:tcPr>
-          <w:p>
-            <w:pPr>
-              <w:rPr>
-                <w:rFonts w:ascii="Times New Roman" w:hAnsi="Times New Roman" w:cs="Times New Roman" w:hint="eastAsia"/>
-                <w:sz w:val="24"/>
-              </w:rPr>
-            </w:pPr>
-            <w:r>
-              <w:rPr>
-                <w:rFonts w:ascii="Times New Roman" w:hAnsi="Times New Roman" w:cs="Times New Roman" w:hint="eastAsia"/>
-                <w:sz w:val="24"/>
-              </w:rPr>
-              <w:t>Sample collection date is empty</w:t>
-            </w:r>
-          </w:p>
-        </w:tc>
-      </w:tr>
-      <w:tr>
-        <w:tc>
-          <w:tcPr>
-            <w:tcW w:w="3687" w:type="dxa"/>
+            <w:tcW w:w="3486" w:type="dxa"/>
             <w:vMerge w:val="restart"/>
           </w:tcPr>
           <w:p>
@@ -800,35 +688,35 @@
                 <w:numId w:val="7"/>
               </w:numPr>
               <w:rPr>
+                <w:rFonts w:ascii="Times New Roman" w:hAnsi="Times New Roman" w:cs="Times New Roman"/>
+                <w:sz w:val="24"/>
+              </w:rPr>
+            </w:pPr>
+            <w:r>
+              <w:rPr>
                 <w:rFonts w:ascii="Times New Roman" w:hAnsi="Times New Roman" w:cs="Times New Roman" w:hint="eastAsia"/>
                 <w:sz w:val="24"/>
               </w:rPr>
+              <w:t>Profiles with information irrelevant to genetic testing</w:t>
+            </w:r>
+          </w:p>
+        </w:tc>
+        <w:tc>
+          <w:tcPr>
+            <w:tcW w:w="2955" w:type="dxa"/>
+          </w:tcPr>
+          <w:p>
+            <w:pPr>
+              <w:rPr>
+                <w:rFonts w:ascii="Times New Roman" w:hAnsi="Times New Roman" w:cs="Times New Roman"/>
+                <w:sz w:val="24"/>
+              </w:rPr>
             </w:pPr>
             <w:r>
               <w:rPr>
                 <w:rFonts w:ascii="Times New Roman" w:hAnsi="Times New Roman" w:cs="Times New Roman" w:hint="eastAsia"/>
                 <w:sz w:val="24"/>
               </w:rPr>
-              <w:t>Profiles with information irrelevant to genetic testing</w:t>
-            </w:r>
-          </w:p>
-        </w:tc>
-        <w:tc>
-          <w:tcPr>
-            <w:tcW w:w="2754" w:type="dxa"/>
-          </w:tcPr>
-          <w:p>
-            <w:pPr>
-              <w:rPr>
-                <w:rFonts w:ascii="Times New Roman" w:hAnsi="Times New Roman" w:cs="Times New Roman" w:hint="eastAsia"/>
-                <w:sz w:val="24"/>
-              </w:rPr>
-            </w:pPr>
-            <w:r>
-              <w:rPr>
-                <w:rFonts w:ascii="Times New Roman" w:hAnsi="Times New Roman" w:cs="Times New Roman" w:hint="eastAsia"/>
-                <w:sz w:val="24"/>
-              </w:rPr>
               <w:t>3a</w:t>
             </w:r>
           </w:p>
@@ -840,7 +728,7 @@
           <w:p>
             <w:pPr>
               <w:rPr>
-                <w:rFonts w:ascii="Times New Roman" w:hAnsi="Times New Roman" w:cs="Times New Roman" w:hint="eastAsia"/>
+                <w:rFonts w:ascii="Times New Roman" w:hAnsi="Times New Roman" w:cs="Times New Roman"/>
                 <w:sz w:val="24"/>
               </w:rPr>
             </w:pPr>
@@ -885,7 +773,7 @@
       <w:tr>
         <w:tc>
           <w:tcPr>
-            <w:tcW w:w="3687" w:type="dxa"/>
+            <w:tcW w:w="3486" w:type="dxa"/>
             <w:vMerge/>
           </w:tcPr>
           <w:p>
@@ -899,111 +787,41 @@
         </w:tc>
         <w:tc>
           <w:tcPr>
-            <w:tcW w:w="2754" w:type="dxa"/>
-          </w:tcPr>
-          <w:p>
-            <w:pPr>
+            <w:tcW w:w="2955" w:type="dxa"/>
+          </w:tcPr>
+          <w:p>
+            <w:pPr>
+              <w:rPr>
+                <w:rFonts w:ascii="Times New Roman" w:hAnsi="Times New Roman" w:cs="Times New Roman"/>
+                <w:sz w:val="24"/>
+              </w:rPr>
+            </w:pPr>
+            <w:r>
               <w:rPr>
                 <w:rFonts w:ascii="Times New Roman" w:hAnsi="Times New Roman" w:cs="Times New Roman" w:hint="eastAsia"/>
                 <w:sz w:val="24"/>
               </w:rPr>
+              <w:t>3b</w:t>
+            </w:r>
+          </w:p>
+        </w:tc>
+        <w:tc>
+          <w:tcPr>
+            <w:tcW w:w="3624" w:type="dxa"/>
+          </w:tcPr>
+          <w:p>
+            <w:pPr>
+              <w:rPr>
+                <w:rFonts w:ascii="Times New Roman" w:hAnsi="Times New Roman" w:cs="Times New Roman"/>
+                <w:sz w:val="24"/>
+              </w:rPr>
             </w:pPr>
             <w:r>
               <w:rPr>
                 <w:rFonts w:ascii="Times New Roman" w:hAnsi="Times New Roman" w:cs="Times New Roman" w:hint="eastAsia"/>
                 <w:sz w:val="24"/>
               </w:rPr>
-              <w:t>3b</w:t>
-            </w:r>
-          </w:p>
-        </w:tc>
-        <w:tc>
-          <w:tcPr>
-            <w:tcW w:w="3624" w:type="dxa"/>
-          </w:tcPr>
-          <w:p>
-            <w:pPr>
-              <w:rPr>
-                <w:rFonts w:ascii="Times New Roman" w:hAnsi="Times New Roman" w:cs="Times New Roman" w:hint="eastAsia"/>
-                <w:sz w:val="24"/>
-              </w:rPr>
-            </w:pPr>
-            <w:r>
-              <w:rPr>
-                <w:rFonts w:ascii="Times New Roman" w:hAnsi="Times New Roman" w:cs="Times New Roman" w:hint="eastAsia"/>
-                <w:sz w:val="24"/>
-              </w:rPr>
               <w:t>The clinical information only describes irrelevant medical history</w:t>
-            </w:r>
-          </w:p>
-        </w:tc>
-      </w:tr>
-      <w:tr>
-        <w:tc>
-          <w:tcPr>
-            <w:tcW w:w="3687" w:type="dxa"/>
-            <w:vMerge/>
-          </w:tcPr>
-          <w:p>
-            <w:pPr>
-              <w:rPr>
-                <w:rFonts w:ascii="Times New Roman" w:hAnsi="Times New Roman" w:cs="Times New Roman"/>
-                <w:sz w:val="24"/>
-              </w:rPr>
-            </w:pPr>
-          </w:p>
-        </w:tc>
-        <w:tc>
-          <w:tcPr>
-            <w:tcW w:w="2754" w:type="dxa"/>
-          </w:tcPr>
-          <w:p>
-            <w:pPr>
-              <w:rPr>
-                <w:rFonts w:ascii="Times New Roman" w:hAnsi="Times New Roman" w:cs="Times New Roman" w:hint="eastAsia"/>
-                <w:sz w:val="24"/>
-              </w:rPr>
-            </w:pPr>
-            <w:r>
-              <w:rPr>
-                <w:rFonts w:ascii="Times New Roman" w:hAnsi="Times New Roman" w:cs="Times New Roman" w:hint="eastAsia"/>
-                <w:sz w:val="24"/>
-              </w:rPr>
-              <w:t>3c</w:t>
-            </w:r>
-          </w:p>
-        </w:tc>
-        <w:tc>
-          <w:tcPr>
-            <w:tcW w:w="3624" w:type="dxa"/>
-          </w:tcPr>
-          <w:p>
-            <w:pPr>
-              <w:rPr>
-                <w:rFonts w:ascii="Times New Roman" w:hAnsi="Times New Roman" w:cs="Times New Roman" w:hint="eastAsia"/>
-                <w:sz w:val="24"/>
-              </w:rPr>
-            </w:pPr>
-            <w:r>
-              <w:rPr>
-                <w:rFonts w:ascii="Times New Roman" w:hAnsi="Times New Roman" w:cs="Times New Roman" w:hint="eastAsia"/>
-                <w:sz w:val="24"/>
-              </w:rPr>
-              <w:t>The clinical information include family history irrelevant to the patient</w:t>
-            </w:r>
-            <w:r>
-              <w:rPr>
-                <w:rFonts w:ascii="Times New Roman" w:hAnsi="Times New Roman" w:cs="Times New Roman"/>
-                <w:sz w:val="24"/>
-              </w:rPr>
-              <w:t>’</w:t>
-            </w:r>
-            <w:r>
-              <w:rPr>
-                <w:rFonts w:ascii="Times New Roman" w:hAnsi="Times New Roman" w:cs="Times New Roman" w:hint="eastAsia"/>
-                <w:sz w:val="24"/>
-              </w:rPr>
-              <w:t>s phenotypes or symptoms</w:t>
             </w:r>
           </w:p>
         </w:tc>
@@ -1012,7 +830,7 @@
     <w:p>
       <w:pPr>
         <w:rPr>
-          <w:rFonts w:ascii="Times New Roman" w:hAnsi="Times New Roman" w:cs="Times New Roman" w:hint="eastAsia"/>
+          <w:rFonts w:ascii="Times New Roman" w:hAnsi="Times New Roman" w:cs="Times New Roman"/>
           <w:sz w:val="24"/>
         </w:rPr>
       </w:pPr>
@@ -1072,7 +890,6 @@
           <w:rFonts w:ascii="Times New Roman" w:hAnsi="Times New Roman" w:cs="Times New Roman"/>
           <w:sz w:val="24"/>
         </w:rPr>
-        <w:lastRenderedPageBreak/>
         <w:t>Generation of ground-truth patient profiles</w:t>
       </w:r>
       <w:r>
@@ -1155,7 +972,7 @@
         </w:numPr>
         <w:spacing w:after="240"/>
         <w:rPr>
-          <w:rFonts w:ascii="Times New Roman" w:hAnsi="Times New Roman" w:cs="Times New Roman" w:hint="eastAsia"/>
+          <w:rFonts w:ascii="Times New Roman" w:hAnsi="Times New Roman" w:cs="Times New Roman"/>
           <w:sz w:val="24"/>
         </w:rPr>
       </w:pPr>
@@ -1197,6 +1014,7 @@
           <w:bCs/>
           <w:sz w:val="24"/>
         </w:rPr>
+        <w:lastRenderedPageBreak/>
         <w:t>2.2</w:t>
       </w:r>
       <w:r>
@@ -1286,7 +1104,7 @@
       <w:pPr>
         <w:spacing w:after="240"/>
         <w:rPr>
-          <w:rFonts w:ascii="Times New Roman" w:hAnsi="Times New Roman" w:cs="Times New Roman" w:hint="eastAsia"/>
+          <w:rFonts w:ascii="Times New Roman" w:hAnsi="Times New Roman" w:cs="Times New Roman"/>
           <w:sz w:val="24"/>
         </w:rPr>
       </w:pPr>
@@ -1352,7 +1170,7 @@
         <w:spacing w:after="240"/>
         <w:jc w:val="center"/>
         <w:rPr>
-          <w:rFonts w:ascii="Times New Roman" w:hAnsi="Times New Roman" w:cs="Times New Roman" w:hint="eastAsia"/>
+          <w:rFonts w:ascii="Times New Roman" w:hAnsi="Times New Roman" w:cs="Times New Roman"/>
           <w:sz w:val="24"/>
         </w:rPr>
       </w:pPr>
@@ -2128,7 +1946,39 @@
                 <w:rFonts w:ascii="Times New Roman" w:hAnsi="Times New Roman" w:cs="Times New Roman"/>
                 <w:sz w:val="24"/>
               </w:rPr>
-              <w:t>Random choice from [LabCorp, GeneDx, Invitae]</w:t>
+              <w:t xml:space="preserve">Random choice from [LabCorp, </w:t>
+            </w:r>
+            <w:proofErr w:type="spellStart"/>
+            <w:r>
+              <w:rPr>
+                <w:rFonts w:ascii="Times New Roman" w:hAnsi="Times New Roman" w:cs="Times New Roman"/>
+                <w:sz w:val="24"/>
+              </w:rPr>
+              <w:t>GeneDx</w:t>
+            </w:r>
+            <w:proofErr w:type="spellEnd"/>
+            <w:r>
+              <w:rPr>
+                <w:rFonts w:ascii="Times New Roman" w:hAnsi="Times New Roman" w:cs="Times New Roman"/>
+                <w:sz w:val="24"/>
+              </w:rPr>
+              <w:t xml:space="preserve">, </w:t>
+            </w:r>
+            <w:proofErr w:type="spellStart"/>
+            <w:r>
+              <w:rPr>
+                <w:rFonts w:ascii="Times New Roman" w:hAnsi="Times New Roman" w:cs="Times New Roman"/>
+                <w:sz w:val="24"/>
+              </w:rPr>
+              <w:t>Invitae</w:t>
+            </w:r>
+            <w:proofErr w:type="spellEnd"/>
+            <w:r>
+              <w:rPr>
+                <w:rFonts w:ascii="Times New Roman" w:hAnsi="Times New Roman" w:cs="Times New Roman"/>
+                <w:sz w:val="24"/>
+              </w:rPr>
+              <w:t>]</w:t>
             </w:r>
           </w:p>
         </w:tc>
@@ -2562,7 +2412,23 @@
                 <w:rFonts w:ascii="Times New Roman" w:hAnsi="Times New Roman" w:cs="Times New Roman"/>
                 <w:sz w:val="24"/>
               </w:rPr>
-              <w:t>Random choice from [Blood, Saliva, Bucal]</w:t>
+              <w:t xml:space="preserve">Random choice from [Blood, Saliva, </w:t>
+            </w:r>
+            <w:proofErr w:type="spellStart"/>
+            <w:r>
+              <w:rPr>
+                <w:rFonts w:ascii="Times New Roman" w:hAnsi="Times New Roman" w:cs="Times New Roman"/>
+                <w:sz w:val="24"/>
+              </w:rPr>
+              <w:t>Bucal</w:t>
+            </w:r>
+            <w:proofErr w:type="spellEnd"/>
+            <w:r>
+              <w:rPr>
+                <w:rFonts w:ascii="Times New Roman" w:hAnsi="Times New Roman" w:cs="Times New Roman"/>
+                <w:sz w:val="24"/>
+              </w:rPr>
+              <w:t>]</w:t>
             </w:r>
           </w:p>
         </w:tc>
@@ -3509,7 +3375,6 @@
           <w:bCs/>
           <w:sz w:val="24"/>
         </w:rPr>
-        <w:lastRenderedPageBreak/>
         <w:t>Clinical Rationale Modeling</w:t>
       </w:r>
     </w:p>
@@ -3577,6 +3442,7 @@
           <w:bCs/>
           <w:sz w:val="24"/>
         </w:rPr>
+        <w:lastRenderedPageBreak/>
         <w:t>Rationale B:</w:t>
       </w:r>
       <w:r>
@@ -3591,7 +3457,7 @@
       <w:pPr>
         <w:spacing w:after="240"/>
         <w:rPr>
-          <w:rFonts w:ascii="Times New Roman" w:hAnsi="Times New Roman" w:cs="Times New Roman" w:hint="eastAsia"/>
+          <w:rFonts w:ascii="Times New Roman" w:hAnsi="Times New Roman" w:cs="Times New Roman"/>
           <w:sz w:val="24"/>
         </w:rPr>
       </w:pPr>
@@ -3687,7 +3553,7 @@
       <w:pPr>
         <w:spacing w:after="240"/>
         <w:rPr>
-          <w:rFonts w:ascii="Times New Roman" w:hAnsi="Times New Roman" w:cs="Times New Roman" w:hint="eastAsia"/>
+          <w:rFonts w:ascii="Times New Roman" w:hAnsi="Times New Roman" w:cs="Times New Roman"/>
           <w:sz w:val="24"/>
         </w:rPr>
       </w:pPr>
@@ -3942,21 +3808,46 @@
             <w:pPr>
               <w:jc w:val="center"/>
               <w:rPr>
+                <w:rFonts w:ascii="Times New Roman" w:hAnsi="Times New Roman" w:cs="Times New Roman"/>
+                <w:b/>
+                <w:bCs/>
+                <w:sz w:val="24"/>
+              </w:rPr>
+            </w:pPr>
+            <w:r>
+              <w:rPr>
+                <w:rFonts w:ascii="Times New Roman" w:hAnsi="Times New Roman" w:cs="Times New Roman"/>
+                <w:b/>
+                <w:bCs/>
+                <w:sz w:val="24"/>
+              </w:rPr>
+              <w:t xml:space="preserve">Error Insertion </w:t>
+            </w:r>
+            <w:r>
+              <w:rPr>
                 <w:rFonts w:ascii="Times New Roman" w:hAnsi="Times New Roman" w:cs="Times New Roman" w:hint="eastAsia"/>
                 <w:b/>
                 <w:bCs/>
                 <w:sz w:val="24"/>
               </w:rPr>
-            </w:pPr>
-            <w:r>
+              <w:t>Description</w:t>
+            </w:r>
+          </w:p>
+        </w:tc>
+        <w:tc>
+          <w:tcPr>
+            <w:tcW w:w="4110" w:type="dxa"/>
+          </w:tcPr>
+          <w:p>
+            <w:pPr>
+              <w:jc w:val="center"/>
               <w:rPr>
                 <w:rFonts w:ascii="Times New Roman" w:hAnsi="Times New Roman" w:cs="Times New Roman"/>
                 <w:b/>
                 <w:bCs/>
                 <w:sz w:val="24"/>
               </w:rPr>
-              <w:t xml:space="preserve">Error Insertion </w:t>
-            </w:r>
+            </w:pPr>
             <w:r>
               <w:rPr>
                 <w:rFonts w:ascii="Times New Roman" w:hAnsi="Times New Roman" w:cs="Times New Roman" w:hint="eastAsia"/>
@@ -3964,31 +3855,6 @@
                 <w:bCs/>
                 <w:sz w:val="24"/>
               </w:rPr>
-              <w:t>Description</w:t>
-            </w:r>
-          </w:p>
-        </w:tc>
-        <w:tc>
-          <w:tcPr>
-            <w:tcW w:w="4110" w:type="dxa"/>
-          </w:tcPr>
-          <w:p>
-            <w:pPr>
-              <w:jc w:val="center"/>
-              <w:rPr>
-                <w:rFonts w:ascii="Times New Roman" w:hAnsi="Times New Roman" w:cs="Times New Roman" w:hint="eastAsia"/>
-                <w:b/>
-                <w:bCs/>
-                <w:sz w:val="24"/>
-              </w:rPr>
-            </w:pPr>
-            <w:r>
-              <w:rPr>
-                <w:rFonts w:ascii="Times New Roman" w:hAnsi="Times New Roman" w:cs="Times New Roman" w:hint="eastAsia"/>
-                <w:b/>
-                <w:bCs/>
-                <w:sz w:val="24"/>
-              </w:rPr>
               <w:t>Example</w:t>
             </w:r>
           </w:p>
@@ -4022,15 +3888,15 @@
           <w:p>
             <w:pPr>
               <w:rPr>
+                <w:rFonts w:ascii="Times New Roman" w:hAnsi="Times New Roman" w:cs="Times New Roman"/>
+                <w:sz w:val="24"/>
+              </w:rPr>
+            </w:pPr>
+            <w:r>
+              <w:rPr>
                 <w:rFonts w:ascii="Times New Roman" w:hAnsi="Times New Roman" w:cs="Times New Roman" w:hint="eastAsia"/>
                 <w:sz w:val="24"/>
               </w:rPr>
-            </w:pPr>
-            <w:r>
-              <w:rPr>
-                <w:rFonts w:ascii="Times New Roman" w:hAnsi="Times New Roman" w:cs="Times New Roman" w:hint="eastAsia"/>
-                <w:sz w:val="24"/>
-              </w:rPr>
               <w:t>For each predefined ICD code, an invalid version of it is created. One of the ICD codes from the ground-truth profile will be replaced with the invalid version.</w:t>
             </w:r>
           </w:p>
@@ -4042,7 +3908,7 @@
           <w:p>
             <w:pPr>
               <w:rPr>
-                <w:rFonts w:ascii="Times New Roman" w:hAnsi="Times New Roman" w:cs="Times New Roman" w:hint="eastAsia"/>
+                <w:rFonts w:ascii="Times New Roman" w:hAnsi="Times New Roman" w:cs="Times New Roman"/>
                 <w:sz w:val="24"/>
               </w:rPr>
             </w:pPr>
@@ -4157,7 +4023,7 @@
                 <w:numId w:val="8"/>
               </w:numPr>
               <w:rPr>
-                <w:rFonts w:ascii="Times New Roman" w:hAnsi="Times New Roman" w:cs="Times New Roman" w:hint="eastAsia"/>
+                <w:rFonts w:ascii="Times New Roman" w:hAnsi="Times New Roman" w:cs="Times New Roman"/>
                 <w:sz w:val="24"/>
               </w:rPr>
             </w:pPr>
@@ -4375,7 +4241,7 @@
           <w:p>
             <w:pPr>
               <w:rPr>
-                <w:rFonts w:ascii="Times New Roman" w:hAnsi="Times New Roman" w:cs="Times New Roman" w:hint="eastAsia"/>
+                <w:rFonts w:ascii="Times New Roman" w:hAnsi="Times New Roman" w:cs="Times New Roman"/>
                 <w:sz w:val="24"/>
               </w:rPr>
             </w:pPr>
@@ -4399,7 +4265,6 @@
                 <w:rFonts w:ascii="Times New Roman" w:hAnsi="Times New Roman" w:cs="Times New Roman"/>
                 <w:sz w:val="24"/>
               </w:rPr>
-              <w:lastRenderedPageBreak/>
               <w:t>2d)</w:t>
             </w:r>
             <w:r>
@@ -4459,7 +4324,7 @@
           <w:p>
             <w:pPr>
               <w:rPr>
-                <w:rFonts w:ascii="Times New Roman" w:hAnsi="Times New Roman" w:cs="Times New Roman" w:hint="eastAsia"/>
+                <w:rFonts w:ascii="Times New Roman" w:hAnsi="Times New Roman" w:cs="Times New Roman"/>
                 <w:sz w:val="24"/>
               </w:rPr>
             </w:pPr>
@@ -4535,7 +4400,7 @@
           <w:p>
             <w:pPr>
               <w:rPr>
-                <w:rFonts w:ascii="Times New Roman" w:hAnsi="Times New Roman" w:cs="Times New Roman" w:hint="eastAsia"/>
+                <w:rFonts w:ascii="Times New Roman" w:hAnsi="Times New Roman" w:cs="Times New Roman"/>
                 <w:sz w:val="24"/>
               </w:rPr>
             </w:pPr>
@@ -4586,7 +4451,15 @@
                 <w:rFonts w:ascii="Times New Roman" w:hAnsi="Times New Roman" w:cs="Times New Roman"/>
                 <w:sz w:val="24"/>
               </w:rPr>
-              <w:t>Predefine a list of ICD codes for [burn, poisoning, sprain, concussion, laceration] and randomly insert 2 or 3 unique ones into the original ICD codes list</w:t>
+              <w:t xml:space="preserve">Predefine a list of ICD codes for [burn, poisoning, sprain, </w:t>
+            </w:r>
+            <w:r>
+              <w:rPr>
+                <w:rFonts w:ascii="Times New Roman" w:hAnsi="Times New Roman" w:cs="Times New Roman"/>
+                <w:sz w:val="24"/>
+              </w:rPr>
+              <w:lastRenderedPageBreak/>
+              <w:t>concussion, laceration] and randomly insert 2 or 3 unique ones into the original ICD codes list</w:t>
             </w:r>
           </w:p>
         </w:tc>
@@ -4597,85 +4470,94 @@
           <w:p>
             <w:pPr>
               <w:rPr>
+                <w:rFonts w:ascii="Times New Roman" w:hAnsi="Times New Roman" w:cs="Times New Roman"/>
+                <w:sz w:val="24"/>
+              </w:rPr>
+            </w:pPr>
+            <w:r>
+              <w:rPr>
                 <w:rFonts w:ascii="Times New Roman" w:hAnsi="Times New Roman" w:cs="Times New Roman" w:hint="eastAsia"/>
                 <w:sz w:val="24"/>
               </w:rPr>
-            </w:pPr>
+              <w:lastRenderedPageBreak/>
+              <w:t>[</w:t>
+            </w:r>
             <w:r>
               <w:rPr>
                 <w:rFonts w:ascii="Times New Roman" w:hAnsi="Times New Roman" w:cs="Times New Roman" w:hint="eastAsia"/>
                 <w:sz w:val="24"/>
               </w:rPr>
-              <w:t>[</w:t>
+              <w:t>E70.20 (d</w:t>
+            </w:r>
+            <w:r>
+              <w:rPr>
+                <w:rFonts w:ascii="Times New Roman" w:hAnsi="Times New Roman" w:cs="Times New Roman"/>
+                <w:sz w:val="24"/>
+              </w:rPr>
+              <w:t>isorders of tyrosine metabolism</w:t>
             </w:r>
             <w:r>
               <w:rPr>
                 <w:rFonts w:ascii="Times New Roman" w:hAnsi="Times New Roman" w:cs="Times New Roman" w:hint="eastAsia"/>
                 <w:sz w:val="24"/>
               </w:rPr>
-              <w:t>E70.20 (d</w:t>
-            </w:r>
-            <w:r>
-              <w:rPr>
-                <w:rFonts w:ascii="Times New Roman" w:hAnsi="Times New Roman" w:cs="Times New Roman"/>
-                <w:sz w:val="24"/>
-              </w:rPr>
-              <w:t>isorders of tyrosine metabolism</w:t>
+              <w:t>), R56.9 (u</w:t>
+            </w:r>
+            <w:r>
+              <w:rPr>
+                <w:rFonts w:ascii="Times New Roman" w:hAnsi="Times New Roman" w:cs="Times New Roman"/>
+                <w:sz w:val="24"/>
+              </w:rPr>
+              <w:t xml:space="preserve">nspecified </w:t>
+            </w:r>
+            <w:r>
+              <w:rPr>
+                <w:rFonts w:ascii="Times New Roman" w:hAnsi="Times New Roman" w:cs="Times New Roman"/>
+                <w:sz w:val="24"/>
+              </w:rPr>
+              <w:lastRenderedPageBreak/>
+              <w:t>convulsions</w:t>
             </w:r>
             <w:r>
               <w:rPr>
                 <w:rFonts w:ascii="Times New Roman" w:hAnsi="Times New Roman" w:cs="Times New Roman" w:hint="eastAsia"/>
                 <w:sz w:val="24"/>
               </w:rPr>
-              <w:t>), R56.9 (u</w:t>
-            </w:r>
-            <w:r>
-              <w:rPr>
-                <w:rFonts w:ascii="Times New Roman" w:hAnsi="Times New Roman" w:cs="Times New Roman"/>
-                <w:sz w:val="24"/>
-              </w:rPr>
-              <w:t>nspecified convulsions</w:t>
+              <w:t xml:space="preserve">), </w:t>
+            </w:r>
+            <w:r>
+              <w:rPr>
+                <w:rFonts w:ascii="Times New Roman" w:hAnsi="Times New Roman" w:cs="Times New Roman"/>
+                <w:sz w:val="24"/>
+              </w:rPr>
+              <w:t>S93.401A</w:t>
             </w:r>
             <w:r>
               <w:rPr>
                 <w:rFonts w:ascii="Times New Roman" w:hAnsi="Times New Roman" w:cs="Times New Roman" w:hint="eastAsia"/>
                 <w:sz w:val="24"/>
               </w:rPr>
-              <w:t xml:space="preserve">), </w:t>
-            </w:r>
-            <w:r>
-              <w:rPr>
-                <w:rFonts w:ascii="Times New Roman" w:hAnsi="Times New Roman" w:cs="Times New Roman"/>
-                <w:sz w:val="24"/>
-              </w:rPr>
-              <w:t>S93.401A</w:t>
+              <w:t xml:space="preserve"> (sprain), </w:t>
+            </w:r>
+            <w:r>
+              <w:rPr>
+                <w:rFonts w:ascii="Times New Roman" w:hAnsi="Times New Roman" w:cs="Times New Roman"/>
+                <w:sz w:val="24"/>
+              </w:rPr>
+              <w:t>S06.0X0A</w:t>
             </w:r>
             <w:r>
               <w:rPr>
                 <w:rFonts w:ascii="Times New Roman" w:hAnsi="Times New Roman" w:cs="Times New Roman" w:hint="eastAsia"/>
                 <w:sz w:val="24"/>
               </w:rPr>
-              <w:t xml:space="preserve"> (sprain), </w:t>
-            </w:r>
-            <w:r>
-              <w:rPr>
-                <w:rFonts w:ascii="Times New Roman" w:hAnsi="Times New Roman" w:cs="Times New Roman"/>
-                <w:sz w:val="24"/>
-              </w:rPr>
-              <w:t>S06.0X0A</w:t>
-            </w:r>
-            <w:r>
-              <w:rPr>
-                <w:rFonts w:ascii="Times New Roman" w:hAnsi="Times New Roman" w:cs="Times New Roman" w:hint="eastAsia"/>
-                <w:sz w:val="24"/>
-              </w:rPr>
               <w:t xml:space="preserve"> (concussion)]</w:t>
             </w:r>
           </w:p>
           <w:p>
             <w:pPr>
               <w:rPr>
-                <w:rFonts w:ascii="Times New Roman" w:hAnsi="Times New Roman" w:cs="Times New Roman" w:hint="eastAsia"/>
+                <w:rFonts w:ascii="Times New Roman" w:hAnsi="Times New Roman" w:cs="Times New Roman"/>
                 <w:sz w:val="24"/>
               </w:rPr>
             </w:pPr>
@@ -4699,6 +4581,7 @@
                 <w:rFonts w:ascii="Times New Roman" w:hAnsi="Times New Roman" w:cs="Times New Roman"/>
                 <w:sz w:val="24"/>
               </w:rPr>
+              <w:lastRenderedPageBreak/>
               <w:t>3b) Completely irrelevant ICD codes</w:t>
             </w:r>
           </w:p>
@@ -4753,98 +4636,77 @@
                 <w:rFonts w:ascii="Times New Roman" w:hAnsi="Times New Roman" w:cs="Times New Roman" w:hint="eastAsia"/>
                 <w:sz w:val="24"/>
               </w:rPr>
-              <w:t>[</w:t>
+              <w:t>[R56.9 (u</w:t>
+            </w:r>
+            <w:r>
+              <w:rPr>
+                <w:rFonts w:ascii="Times New Roman" w:hAnsi="Times New Roman" w:cs="Times New Roman"/>
+                <w:sz w:val="24"/>
+              </w:rPr>
+              <w:t>nspecified convulsions</w:t>
             </w:r>
             <w:r>
               <w:rPr>
                 <w:rFonts w:ascii="Times New Roman" w:hAnsi="Times New Roman" w:cs="Times New Roman" w:hint="eastAsia"/>
                 <w:sz w:val="24"/>
               </w:rPr>
-              <w:t>R56.9 (u</w:t>
-            </w:r>
-            <w:r>
-              <w:rPr>
-                <w:rFonts w:ascii="Times New Roman" w:hAnsi="Times New Roman" w:cs="Times New Roman"/>
-                <w:sz w:val="24"/>
-              </w:rPr>
-              <w:t>nspecified convulsions</w:t>
+              <w:t xml:space="preserve">), </w:t>
+            </w:r>
+            <w:r>
+              <w:rPr>
+                <w:rFonts w:ascii="Times New Roman" w:hAnsi="Times New Roman" w:cs="Times New Roman"/>
+                <w:sz w:val="24"/>
+              </w:rPr>
+              <w:t>S93.401A</w:t>
             </w:r>
             <w:r>
               <w:rPr>
                 <w:rFonts w:ascii="Times New Roman" w:hAnsi="Times New Roman" w:cs="Times New Roman" w:hint="eastAsia"/>
                 <w:sz w:val="24"/>
               </w:rPr>
-              <w:t xml:space="preserve">), </w:t>
-            </w:r>
-            <w:r>
-              <w:rPr>
-                <w:rFonts w:ascii="Times New Roman" w:hAnsi="Times New Roman" w:cs="Times New Roman"/>
-                <w:sz w:val="24"/>
-              </w:rPr>
-              <w:t>S93.401A</w:t>
+              <w:t xml:space="preserve"> (sprain), </w:t>
+            </w:r>
+            <w:r>
+              <w:rPr>
+                <w:rFonts w:ascii="Times New Roman" w:hAnsi="Times New Roman" w:cs="Times New Roman"/>
+                <w:sz w:val="24"/>
+              </w:rPr>
+              <w:t>S06.0X0A</w:t>
             </w:r>
             <w:r>
               <w:rPr>
                 <w:rFonts w:ascii="Times New Roman" w:hAnsi="Times New Roman" w:cs="Times New Roman" w:hint="eastAsia"/>
                 <w:sz w:val="24"/>
               </w:rPr>
-              <w:t xml:space="preserve"> (sprain), </w:t>
-            </w:r>
-            <w:r>
-              <w:rPr>
-                <w:rFonts w:ascii="Times New Roman" w:hAnsi="Times New Roman" w:cs="Times New Roman"/>
-                <w:sz w:val="24"/>
-              </w:rPr>
-              <w:t>S06.0X0A</w:t>
+              <w:t xml:space="preserve"> (concussion), </w:t>
+            </w:r>
+            <w:r>
+              <w:rPr>
+                <w:rFonts w:ascii="Times New Roman" w:hAnsi="Times New Roman" w:cs="Times New Roman"/>
+                <w:sz w:val="24"/>
+              </w:rPr>
+              <w:t> S01.01XA</w:t>
             </w:r>
             <w:r>
               <w:rPr>
                 <w:rFonts w:ascii="Times New Roman" w:hAnsi="Times New Roman" w:cs="Times New Roman" w:hint="eastAsia"/>
                 <w:sz w:val="24"/>
               </w:rPr>
-              <w:t xml:space="preserve"> (concussion)</w:t>
+              <w:t xml:space="preserve"> (</w:t>
+            </w:r>
+            <w:r>
+              <w:rPr>
+                <w:rFonts w:ascii="Times New Roman" w:hAnsi="Times New Roman" w:cs="Times New Roman"/>
+                <w:sz w:val="24"/>
+              </w:rPr>
+              <w:t>laceration</w:t>
             </w:r>
             <w:r>
               <w:rPr>
                 <w:rFonts w:ascii="Times New Roman" w:hAnsi="Times New Roman" w:cs="Times New Roman" w:hint="eastAsia"/>
                 <w:sz w:val="24"/>
               </w:rPr>
-              <w:t xml:space="preserve">, </w:t>
-            </w:r>
-            <w:r>
-              <w:rPr>
-                <w:rFonts w:ascii="Times New Roman" w:hAnsi="Times New Roman" w:cs="Times New Roman"/>
-                <w:sz w:val="24"/>
-              </w:rPr>
-              <w:t> S01.01XA</w:t>
-            </w:r>
-            <w:r>
-              <w:rPr>
-                <w:rFonts w:ascii="Times New Roman" w:hAnsi="Times New Roman" w:cs="Times New Roman" w:hint="eastAsia"/>
-                <w:sz w:val="24"/>
-              </w:rPr>
-              <w:t xml:space="preserve"> (</w:t>
-            </w:r>
-            <w:r>
-              <w:rPr>
-                <w:rFonts w:ascii="Times New Roman" w:hAnsi="Times New Roman" w:cs="Times New Roman"/>
-                <w:sz w:val="24"/>
-              </w:rPr>
-              <w:t>laceration</w:t>
-            </w:r>
-            <w:r>
-              <w:rPr>
-                <w:rFonts w:ascii="Times New Roman" w:hAnsi="Times New Roman" w:cs="Times New Roman" w:hint="eastAsia"/>
-                <w:sz w:val="24"/>
-              </w:rPr>
-              <w:t>)</w:t>
-            </w:r>
-            <w:r>
-              <w:rPr>
-                <w:rFonts w:ascii="Times New Roman" w:hAnsi="Times New Roman" w:cs="Times New Roman" w:hint="eastAsia"/>
-                <w:sz w:val="24"/>
-              </w:rPr>
-              <w:t>]</w:t>
+              <w:t>)]</w:t>
             </w:r>
           </w:p>
         </w:tc>
@@ -4877,15 +4739,15 @@
           <w:p>
             <w:pPr>
               <w:rPr>
+                <w:rFonts w:ascii="Times New Roman" w:hAnsi="Times New Roman" w:cs="Times New Roman"/>
+                <w:sz w:val="24"/>
+              </w:rPr>
+            </w:pPr>
+            <w:r>
+              <w:rPr>
                 <w:rFonts w:ascii="Times New Roman" w:hAnsi="Times New Roman" w:cs="Times New Roman" w:hint="eastAsia"/>
                 <w:sz w:val="24"/>
               </w:rPr>
-            </w:pPr>
-            <w:r>
-              <w:rPr>
-                <w:rFonts w:ascii="Times New Roman" w:hAnsi="Times New Roman" w:cs="Times New Roman" w:hint="eastAsia"/>
-                <w:sz w:val="24"/>
-              </w:rPr>
               <w:t>LLM-prompt based; see next stage</w:t>
             </w:r>
           </w:p>
@@ -4897,7 +4759,7 @@
           <w:p>
             <w:pPr>
               <w:rPr>
-                <w:rFonts w:ascii="Times New Roman" w:hAnsi="Times New Roman" w:cs="Times New Roman" w:hint="eastAsia"/>
+                <w:rFonts w:ascii="Times New Roman" w:hAnsi="Times New Roman" w:cs="Times New Roman"/>
                 <w:sz w:val="24"/>
               </w:rPr>
             </w:pPr>
@@ -4923,7 +4785,7 @@
       <w:pPr>
         <w:spacing w:after="240"/>
         <w:rPr>
-          <w:rFonts w:ascii="Times New Roman" w:hAnsi="Times New Roman" w:cs="Times New Roman" w:hint="eastAsia"/>
+          <w:rFonts w:ascii="Times New Roman" w:hAnsi="Times New Roman" w:cs="Times New Roman"/>
           <w:sz w:val="24"/>
         </w:rPr>
       </w:pPr>
@@ -4961,7 +4823,7 @@
       <w:pPr>
         <w:spacing w:after="240"/>
         <w:rPr>
-          <w:rFonts w:ascii="Times New Roman" w:hAnsi="Times New Roman" w:cs="Times New Roman" w:hint="eastAsia"/>
+          <w:rFonts w:ascii="Times New Roman" w:hAnsi="Times New Roman" w:cs="Times New Roman"/>
           <w:sz w:val="24"/>
         </w:rPr>
       </w:pPr>
@@ -5059,7 +4921,7 @@
       <w:pPr>
         <w:spacing w:before="0" w:after="240"/>
         <w:rPr>
-          <w:rFonts w:ascii="Times New Roman" w:hAnsi="Times New Roman" w:cs="Times New Roman" w:hint="eastAsia"/>
+          <w:rFonts w:ascii="Times New Roman" w:hAnsi="Times New Roman" w:cs="Times New Roman"/>
           <w:sz w:val="24"/>
         </w:rPr>
       </w:pPr>
@@ -5091,7 +4953,39 @@
           <w:rFonts w:ascii="Times New Roman" w:hAnsi="Times New Roman" w:cs="Times New Roman"/>
           <w:sz w:val="24"/>
         </w:rPr>
-        <w:t>3) If family_history is marked true, generate records for affected relatives and/or consanguinity with details.Provide details such as the relative's relationship and condition.</w:t>
+        <w:t xml:space="preserve">3) If </w:t>
+      </w:r>
+      <w:proofErr w:type="spellStart"/>
+      <w:r>
+        <w:rPr>
+          <w:rFonts w:ascii="Times New Roman" w:hAnsi="Times New Roman" w:cs="Times New Roman"/>
+          <w:sz w:val="24"/>
+        </w:rPr>
+        <w:t>family_history</w:t>
+      </w:r>
+      <w:proofErr w:type="spellEnd"/>
+      <w:r>
+        <w:rPr>
+          <w:rFonts w:ascii="Times New Roman" w:hAnsi="Times New Roman" w:cs="Times New Roman"/>
+          <w:sz w:val="24"/>
+        </w:rPr>
+        <w:t xml:space="preserve"> is marked true, generate records for affected relatives and/or consanguinity with </w:t>
+      </w:r>
+      <w:proofErr w:type="spellStart"/>
+      <w:r>
+        <w:rPr>
+          <w:rFonts w:ascii="Times New Roman" w:hAnsi="Times New Roman" w:cs="Times New Roman"/>
+          <w:sz w:val="24"/>
+        </w:rPr>
+        <w:t>details.Provide</w:t>
+      </w:r>
+      <w:proofErr w:type="spellEnd"/>
+      <w:r>
+        <w:rPr>
+          <w:rFonts w:ascii="Times New Roman" w:hAnsi="Times New Roman" w:cs="Times New Roman"/>
+          <w:sz w:val="24"/>
+        </w:rPr>
+        <w:t xml:space="preserve"> details such as the relative's relationship and condition.</w:t>
       </w:r>
     </w:p>
     <w:p>
@@ -5107,8 +5001,55 @@
           <w:rFonts w:ascii="Times New Roman" w:hAnsi="Times New Roman" w:cs="Times New Roman"/>
           <w:sz w:val="24"/>
         </w:rPr>
-        <w:lastRenderedPageBreak/>
-        <w:t>4) If any of the mca, dd_id, dysmorphic, neurological, metabolic, autism, early_onset flags are False, completely ignore them</w:t>
+        <w:t xml:space="preserve">4) If any of the </w:t>
+      </w:r>
+      <w:proofErr w:type="spellStart"/>
+      <w:r>
+        <w:rPr>
+          <w:rFonts w:ascii="Times New Roman" w:hAnsi="Times New Roman" w:cs="Times New Roman"/>
+          <w:sz w:val="24"/>
+        </w:rPr>
+        <w:t>mca</w:t>
+      </w:r>
+      <w:proofErr w:type="spellEnd"/>
+      <w:r>
+        <w:rPr>
+          <w:rFonts w:ascii="Times New Roman" w:hAnsi="Times New Roman" w:cs="Times New Roman"/>
+          <w:sz w:val="24"/>
+        </w:rPr>
+        <w:t xml:space="preserve">, </w:t>
+      </w:r>
+      <w:proofErr w:type="spellStart"/>
+      <w:r>
+        <w:rPr>
+          <w:rFonts w:ascii="Times New Roman" w:hAnsi="Times New Roman" w:cs="Times New Roman"/>
+          <w:sz w:val="24"/>
+        </w:rPr>
+        <w:t>dd_id</w:t>
+      </w:r>
+      <w:proofErr w:type="spellEnd"/>
+      <w:r>
+        <w:rPr>
+          <w:rFonts w:ascii="Times New Roman" w:hAnsi="Times New Roman" w:cs="Times New Roman"/>
+          <w:sz w:val="24"/>
+        </w:rPr>
+        <w:t xml:space="preserve">, dysmorphic, neurological, metabolic, autism, </w:t>
+      </w:r>
+      <w:proofErr w:type="spellStart"/>
+      <w:r>
+        <w:rPr>
+          <w:rFonts w:ascii="Times New Roman" w:hAnsi="Times New Roman" w:cs="Times New Roman"/>
+          <w:sz w:val="24"/>
+        </w:rPr>
+        <w:t>early_onset</w:t>
+      </w:r>
+      <w:proofErr w:type="spellEnd"/>
+      <w:r>
+        <w:rPr>
+          <w:rFonts w:ascii="Times New Roman" w:hAnsi="Times New Roman" w:cs="Times New Roman"/>
+          <w:sz w:val="24"/>
+        </w:rPr>
+        <w:t xml:space="preserve"> flags are False, completely ignore them</w:t>
       </w:r>
       <w:r>
         <w:rPr>
@@ -5138,7 +5079,23 @@
           <w:rFonts w:ascii="Times New Roman" w:hAnsi="Times New Roman" w:cs="Times New Roman"/>
           <w:sz w:val="24"/>
         </w:rPr>
-        <w:t>5) If sample_type is "3c", ALWAYS write family history details that are medically plausible but unrelated to the patient's phenotypes,</w:t>
+        <w:t xml:space="preserve">5) If </w:t>
+      </w:r>
+      <w:proofErr w:type="spellStart"/>
+      <w:r>
+        <w:rPr>
+          <w:rFonts w:ascii="Times New Roman" w:hAnsi="Times New Roman" w:cs="Times New Roman"/>
+          <w:sz w:val="24"/>
+        </w:rPr>
+        <w:t>sample_type</w:t>
+      </w:r>
+      <w:proofErr w:type="spellEnd"/>
+      <w:r>
+        <w:rPr>
+          <w:rFonts w:ascii="Times New Roman" w:hAnsi="Times New Roman" w:cs="Times New Roman"/>
+          <w:sz w:val="24"/>
+        </w:rPr>
+        <w:t xml:space="preserve"> is "3c", ALWAYS write family history details that are medically plausible but unrelated to the patient's phenotypes,</w:t>
       </w:r>
       <w:r>
         <w:rPr>
@@ -5152,7 +5109,39 @@
           <w:rFonts w:ascii="Times New Roman" w:hAnsi="Times New Roman" w:cs="Times New Roman"/>
           <w:sz w:val="24"/>
         </w:rPr>
-        <w:t>regardless of whether family_history is true or false. If family_history is also set to true, mix both relevant and irrelevant family history details. Integrate these details naturally, without labeling them as relevant / irrelevant or explaining their relation to the presentation.</w:t>
+        <w:t xml:space="preserve">regardless of whether </w:t>
+      </w:r>
+      <w:proofErr w:type="spellStart"/>
+      <w:r>
+        <w:rPr>
+          <w:rFonts w:ascii="Times New Roman" w:hAnsi="Times New Roman" w:cs="Times New Roman"/>
+          <w:sz w:val="24"/>
+        </w:rPr>
+        <w:t>family_history</w:t>
+      </w:r>
+      <w:proofErr w:type="spellEnd"/>
+      <w:r>
+        <w:rPr>
+          <w:rFonts w:ascii="Times New Roman" w:hAnsi="Times New Roman" w:cs="Times New Roman"/>
+          <w:sz w:val="24"/>
+        </w:rPr>
+        <w:t xml:space="preserve"> is true or false. If </w:t>
+      </w:r>
+      <w:proofErr w:type="spellStart"/>
+      <w:r>
+        <w:rPr>
+          <w:rFonts w:ascii="Times New Roman" w:hAnsi="Times New Roman" w:cs="Times New Roman"/>
+          <w:sz w:val="24"/>
+        </w:rPr>
+        <w:t>family_history</w:t>
+      </w:r>
+      <w:proofErr w:type="spellEnd"/>
+      <w:r>
+        <w:rPr>
+          <w:rFonts w:ascii="Times New Roman" w:hAnsi="Times New Roman" w:cs="Times New Roman"/>
+          <w:sz w:val="24"/>
+        </w:rPr>
+        <w:t xml:space="preserve"> is also set to true, mix both relevant and irrelevant family history details. Integrate these details naturally, without labeling them as relevant / irrelevant or explaining their relation to the presentation.</w:t>
       </w:r>
     </w:p>
     <w:p>
@@ -5168,14 +5157,63 @@
           <w:rFonts w:ascii="Times New Roman" w:hAnsi="Times New Roman" w:cs="Times New Roman"/>
           <w:sz w:val="24"/>
         </w:rPr>
-        <w:t>6) If prior_test_type, prior_test_result, and prior_test_date values are provided, generate a brief summary of the prior genetic testing including both date and outcome. If they are not provided, do not mention anything about prior test at all.</w:t>
+        <w:lastRenderedPageBreak/>
+        <w:t xml:space="preserve">6) If </w:t>
+      </w:r>
+      <w:proofErr w:type="spellStart"/>
+      <w:r>
+        <w:rPr>
+          <w:rFonts w:ascii="Times New Roman" w:hAnsi="Times New Roman" w:cs="Times New Roman"/>
+          <w:sz w:val="24"/>
+        </w:rPr>
+        <w:t>prior_test_type</w:t>
+      </w:r>
+      <w:proofErr w:type="spellEnd"/>
+      <w:r>
+        <w:rPr>
+          <w:rFonts w:ascii="Times New Roman" w:hAnsi="Times New Roman" w:cs="Times New Roman"/>
+          <w:sz w:val="24"/>
+        </w:rPr>
+        <w:t xml:space="preserve">, </w:t>
+      </w:r>
+      <w:proofErr w:type="spellStart"/>
+      <w:r>
+        <w:rPr>
+          <w:rFonts w:ascii="Times New Roman" w:hAnsi="Times New Roman" w:cs="Times New Roman"/>
+          <w:sz w:val="24"/>
+        </w:rPr>
+        <w:t>prior_test_result</w:t>
+      </w:r>
+      <w:proofErr w:type="spellEnd"/>
+      <w:r>
+        <w:rPr>
+          <w:rFonts w:ascii="Times New Roman" w:hAnsi="Times New Roman" w:cs="Times New Roman"/>
+          <w:sz w:val="24"/>
+        </w:rPr>
+        <w:t xml:space="preserve">, and </w:t>
+      </w:r>
+      <w:proofErr w:type="spellStart"/>
+      <w:r>
+        <w:rPr>
+          <w:rFonts w:ascii="Times New Roman" w:hAnsi="Times New Roman" w:cs="Times New Roman"/>
+          <w:sz w:val="24"/>
+        </w:rPr>
+        <w:t>prior_test_date</w:t>
+      </w:r>
+      <w:proofErr w:type="spellEnd"/>
+      <w:r>
+        <w:rPr>
+          <w:rFonts w:ascii="Times New Roman" w:hAnsi="Times New Roman" w:cs="Times New Roman"/>
+          <w:sz w:val="24"/>
+        </w:rPr>
+        <w:t xml:space="preserve"> values are provided, generate a brief summary of the prior genetic testing including both date and outcome. If they are not provided, do not mention anything about prior test at all.</w:t>
       </w:r>
     </w:p>
     <w:p>
       <w:pPr>
         <w:spacing w:before="0" w:after="240"/>
         <w:rPr>
-          <w:rFonts w:ascii="Times New Roman" w:hAnsi="Times New Roman" w:cs="Times New Roman" w:hint="eastAsia"/>
+          <w:rFonts w:ascii="Times New Roman" w:hAnsi="Times New Roman" w:cs="Times New Roman"/>
           <w:sz w:val="24"/>
         </w:rPr>
       </w:pPr>
@@ -5205,7 +5243,7 @@
 </file>
 
 <file path=word/numbering.xml><?xml version="1.0" encoding="utf-8"?>
-<w:numbering xmlns:wpc="http://schemas.microsoft.com/office/word/2010/wordprocessingCanvas" xmlns:cx="http://schemas.microsoft.com/office/drawing/2014/chartex" xmlns:cx1="http://schemas.microsoft.com/office/drawing/2015/9/8/chartex" xmlns:cx2="http://schemas.microsoft.com/office/drawing/2015/10/21/chartex" xmlns:cx3="http://schemas.microsoft.com/office/drawing/2016/5/9/chartex" xmlns:cx4="http://schemas.microsoft.com/office/drawing/2016/5/10/chartex" xmlns:cx5="http://schemas.microsoft.com/office/drawing/2016/5/11/chartex" xmlns:cx6="http://schemas.microsoft.com/office/drawing/2016/5/12/chartex" xmlns:cx7="http://schemas.microsoft.com/office/drawing/2016/5/13/chartex" xmlns:cx8="http://schemas.microsoft.com/office/drawing/2016/5/14/chartex" xmlns:mc="http://schemas.openxmlformats.org/markup-compatibility/2006" xmlns:aink="http://schemas.microsoft.com/office/drawing/2016/ink" xmlns:am3d="http://schemas.microsoft.com/office/drawing/2017/model3d" xmlns:o="urn:schemas-microsoft-com:office:office" xmlns:oel="http://schemas.microsoft.com/office/2019/extlst" xmlns:r="http://schemas.openxmlformats.org/officeDocument/2006/relationships" xmlns:m="http://schemas.openxmlformats.org/officeDocument/2006/math" xmlns:v="urn:schemas-microsoft-com:vml" xmlns:wp14="http://schemas.microsoft.com/office/word/2010/wordprocessingDrawing" xmlns:wp="http://schemas.openxmlformats.org/drawingml/2006/wordprocessingDrawing" xmlns:w10="urn:schemas-microsoft-com:office:word" xmlns:w="http://schemas.openxmlformats.org/wordprocessingml/2006/main" xmlns:w14="http://schemas.microsoft.com/office/word/2010/wordml" xmlns:w15="http://schemas.microsoft.com/office/word/2012/wordml" xmlns:w16cex="http://schemas.microsoft.com/office/word/2018/wordml/cex" xmlns:w16cid="http://schemas.microsoft.com/office/word/2016/wordml/cid" xmlns:w16="http://schemas.microsoft.com/office/word/2018/wordml" xmlns:w16du="http://schemas.microsoft.com/office/word/2023/wordml/word16du" xmlns:w16sdtdh="http://schemas.microsoft.com/office/word/2020/wordml/sdtdatahash" xmlns:w16sdtfl="http://schemas.microsoft.com/office/word/2024/wordml/sdtformatlock" xmlns:w16se="http://schemas.microsoft.com/office/word/2015/wordml/symex" xmlns:wpg="http://schemas.microsoft.com/office/word/2010/wordprocessingGroup" xmlns:wpi="http://schemas.microsoft.com/office/word/2010/wordprocessingInk" xmlns:wne="http://schemas.microsoft.com/office/word/2006/wordml" xmlns:wps="http://schemas.microsoft.com/office/word/2010/wordprocessingShape" mc:Ignorable="w14 w15 w16se w16cid w16 w16cex w16sdtdh w16sdtfl w16du wp14">
+<w:numbering xmlns:wpc="http://schemas.microsoft.com/office/word/2010/wordprocessingCanvas" xmlns:cx="http://schemas.microsoft.com/office/drawing/2014/chartex" xmlns:cx1="http://schemas.microsoft.com/office/drawing/2015/9/8/chartex" xmlns:cx2="http://schemas.microsoft.com/office/drawing/2015/10/21/chartex" xmlns:cx3="http://schemas.microsoft.com/office/drawing/2016/5/9/chartex" xmlns:cx4="http://schemas.microsoft.com/office/drawing/2016/5/10/chartex" xmlns:cx5="http://schemas.microsoft.com/office/drawing/2016/5/11/chartex" xmlns:cx6="http://schemas.microsoft.com/office/drawing/2016/5/12/chartex" xmlns:cx7="http://schemas.microsoft.com/office/drawing/2016/5/13/chartex" xmlns:cx8="http://schemas.microsoft.com/office/drawing/2016/5/14/chartex" xmlns:mc="http://schemas.openxmlformats.org/markup-compatibility/2006" xmlns:aink="http://schemas.microsoft.com/office/drawing/2016/ink" xmlns:am3d="http://schemas.microsoft.com/office/drawing/2017/model3d" xmlns:o="urn:schemas-microsoft-com:office:office" xmlns:oel="http://schemas.microsoft.com/office/2019/extlst" xmlns:r="http://schemas.openxmlformats.org/officeDocument/2006/relationships" xmlns:m="http://schemas.openxmlformats.org/officeDocument/2006/math" xmlns:v="urn:schemas-microsoft-com:vml" xmlns:wp14="http://schemas.microsoft.com/office/word/2010/wordprocessingDrawing" xmlns:wp="http://schemas.openxmlformats.org/drawingml/2006/wordprocessingDrawing" xmlns:w10="urn:schemas-microsoft-com:office:word" xmlns:w="http://schemas.openxmlformats.org/wordprocessingml/2006/main" xmlns:w14="http://schemas.microsoft.com/office/word/2010/wordml" xmlns:w15="http://schemas.microsoft.com/office/word/2012/wordml" xmlns:w16cex="http://schemas.microsoft.com/office/word/2018/wordml/cex" xmlns:w16cid="http://schemas.microsoft.com/office/word/2016/wordml/cid" xmlns:w16="http://schemas.microsoft.com/office/word/2018/wordml" xmlns:w16du="http://schemas.microsoft.com/office/word/2023/wordml/word16du" xmlns:w16sdtdh="http://schemas.microsoft.com/office/word/2020/wordml/sdtdatahash" xmlns:w16se="http://schemas.microsoft.com/office/word/2015/wordml/symex" xmlns:wpg="http://schemas.microsoft.com/office/word/2010/wordprocessingGroup" xmlns:wpi="http://schemas.microsoft.com/office/word/2010/wordprocessingInk" xmlns:wne="http://schemas.microsoft.com/office/word/2006/wordml" xmlns:wps="http://schemas.microsoft.com/office/word/2010/wordprocessingShape" mc:Ignorable="w14 w15 w16se w16cid w16 w16cex w16sdtdh w16du wp14">
   <w:abstractNum w:abstractNumId="0" w15:restartNumberingAfterBreak="0">
     <w:nsid w:val="20F63E4E"/>
     <w:multiLevelType w:val="hybridMultilevel"/>
@@ -6397,7 +6435,7 @@
 </file>
 
 <file path=word/styles.xml><?xml version="1.0" encoding="utf-8"?>
-<w:styles xmlns:mc="http://schemas.openxmlformats.org/markup-compatibility/2006" xmlns:r="http://schemas.openxmlformats.org/officeDocument/2006/relationships" xmlns:w="http://schemas.openxmlformats.org/wordprocessingml/2006/main" xmlns:w14="http://schemas.microsoft.com/office/word/2010/wordml" xmlns:w15="http://schemas.microsoft.com/office/word/2012/wordml" xmlns:w16cex="http://schemas.microsoft.com/office/word/2018/wordml/cex" xmlns:w16cid="http://schemas.microsoft.com/office/word/2016/wordml/cid" xmlns:w16="http://schemas.microsoft.com/office/word/2018/wordml" xmlns:w16du="http://schemas.microsoft.com/office/word/2023/wordml/word16du" xmlns:w16sdtdh="http://schemas.microsoft.com/office/word/2020/wordml/sdtdatahash" xmlns:w16sdtfl="http://schemas.microsoft.com/office/word/2024/wordml/sdtformatlock" xmlns:w16se="http://schemas.microsoft.com/office/word/2015/wordml/symex" mc:Ignorable="w14 w15 w16se w16cid w16 w16cex w16sdtdh w16sdtfl w16du">
+<w:styles xmlns:mc="http://schemas.openxmlformats.org/markup-compatibility/2006" xmlns:r="http://schemas.openxmlformats.org/officeDocument/2006/relationships" xmlns:w="http://schemas.openxmlformats.org/wordprocessingml/2006/main" xmlns:w14="http://schemas.microsoft.com/office/word/2010/wordml" xmlns:w15="http://schemas.microsoft.com/office/word/2012/wordml" xmlns:w16cex="http://schemas.microsoft.com/office/word/2018/wordml/cex" xmlns:w16cid="http://schemas.microsoft.com/office/word/2016/wordml/cid" xmlns:w16="http://schemas.microsoft.com/office/word/2018/wordml" xmlns:w16du="http://schemas.microsoft.com/office/word/2023/wordml/word16du" xmlns:w16sdtdh="http://schemas.microsoft.com/office/word/2020/wordml/sdtdatahash" xmlns:w16se="http://schemas.microsoft.com/office/word/2015/wordml/symex" mc:Ignorable="w14 w15 w16se w16cid w16 w16cex w16sdtdh w16du">
   <w:docDefaults>
     <w:rPrDefault>
       <w:rPr>
@@ -7001,6 +7039,7 @@
   <w:style w:type="character" w:default="1" w:styleId="DefaultParagraphFont">
     <w:name w:val="Default Paragraph Font"/>
     <w:uiPriority w:val="1"/>
+    <w:semiHidden/>
     <w:unhideWhenUsed/>
   </w:style>
   <w:style w:type="table" w:default="1" w:styleId="TableNormal">

</xml_diff>